<commit_message>
docs(u4): informe con capturas reales de Cursor y Vercel (asesoria-planes.vercel.app) y figuras de código
Co-Authored-By: Claude Fable 5.1 <noreply@anthropic.com>
Claude-Session: https://claude.ai/code/session_01CPmJiBWTMQ6Le4d6Lmujff
</commit_message>
<xml_diff>
--- a/docs/Informe_E2E_IA_TestSprite_AsesorIA_Unidad4.docx
+++ b/docs/Informe_E2E_IA_TestSprite_AsesorIA_Unidad4.docx
@@ -1278,7 +1278,7 @@
       <w:r>
         <w:drawing>
           <wp:inline distT="0" distB="0" distL="0" distR="0">
-            <wp:extent cx="4953000" cy="1200150"/>
+            <wp:extent cx="5905500" cy="2533650"/>
             <wp:effectExtent t="0" r="0" b="0" l="0"/>
             <wp:docPr id="1" name="" descr="" title=""/>
             <wp:cNvGraphicFramePr>
@@ -1303,7 +1303,7 @@
                   <pic:spPr bwMode="auto">
                     <a:xfrm>
                       <a:off x="0" y="0"/>
-                      <a:ext cx="4953000" cy="1200150"/>
+                      <a:ext cx="5905500" cy="2533650"/>
                     </a:xfrm>
                     <a:prstGeom prst="rect">
                       <a:avLst/>
@@ -1330,7 +1330,7 @@
           <w:sz w:val="14"/>
           <w:szCs w:val="14"/>
         </w:rPr>
-        <w:t xml:space="preserve">Figura 3. Generación y refinamiento en Cursor (captura pendiente; ver Anexo).</w:t>
+        <w:t xml:space="preserve">Figura 3. Código generado y refinado con IA: lib/payments.ts (interfaz PaymentProvider con Stripe y mock) y tests/support/healing.ts (localizadores auto-curables).</w:t>
       </w:r>
     </w:p>
     <w:p>
@@ -1342,7 +1342,7 @@
       <w:r>
         <w:drawing>
           <wp:inline distT="0" distB="0" distL="0" distR="0">
-            <wp:extent cx="4953000" cy="1200150"/>
+            <wp:extent cx="5905500" cy="3857625"/>
             <wp:effectExtent t="0" r="0" b="0" l="0"/>
             <wp:docPr id="1" name="" descr="" title=""/>
             <wp:cNvGraphicFramePr>
@@ -1367,7 +1367,7 @@
                   <pic:spPr bwMode="auto">
                     <a:xfrm>
                       <a:off x="0" y="0"/>
-                      <a:ext cx="4953000" cy="1200150"/>
+                      <a:ext cx="5905500" cy="3857625"/>
                     </a:xfrm>
                     <a:prstGeom prst="rect">
                       <a:avLst/>
@@ -1394,7 +1394,71 @@
           <w:sz w:val="14"/>
           <w:szCs w:val="14"/>
         </w:rPr>
-        <w:t xml:space="preserve">Figura 4. Despliegue automatizado en Vercel (captura pendiente; ver Anexo).</w:t>
+        <w:t xml:space="preserve">Figura 4. Agente de Cursor (Grok 4.6) sobre el repositorio asesoria-testing: clona, instala dependencias, crea .env.local con el proveedor mock y levanta la app en localhost:3001 (navegador integrado a la derecha).</w:t>
+      </w:r>
+    </w:p>
+    <w:p>
+      <w:pPr>
+        <w:keepNext/>
+        <w:spacing w:after="20" w:before="60"/>
+        <w:jc w:val="center"/>
+      </w:pPr>
+      <w:r>
+        <w:drawing>
+          <wp:inline distT="0" distB="0" distL="0" distR="0">
+            <wp:extent cx="4476750" cy="5029200"/>
+            <wp:effectExtent t="0" r="0" b="0" l="0"/>
+            <wp:docPr id="1" name="" descr="" title=""/>
+            <wp:cNvGraphicFramePr>
+              <a:graphicFrameLocks xmlns:a="http://schemas.openxmlformats.org/drawingml/2006/main" noChangeAspect="1"/>
+            </wp:cNvGraphicFramePr>
+            <a:graphic xmlns:a="http://schemas.openxmlformats.org/drawingml/2006/main">
+              <a:graphicData uri="http://schemas.openxmlformats.org/drawingml/2006/picture">
+                <pic:pic xmlns:pic="http://schemas.openxmlformats.org/drawingml/2006/picture">
+                  <pic:nvPicPr>
+                    <pic:cNvPr id="0" name="" descr=""/>
+                    <pic:cNvPicPr>
+                      <a:picLocks noChangeAspect="1" noChangeArrowheads="1"/>
+                    </pic:cNvPicPr>
+                  </pic:nvPicPr>
+                  <pic:blipFill>
+                    <a:blip r:embed="rId13" cstate="none"/>
+                    <a:srcRect/>
+                    <a:stretch>
+                      <a:fillRect/>
+                    </a:stretch>
+                  </pic:blipFill>
+                  <pic:spPr bwMode="auto">
+                    <a:xfrm>
+                      <a:off x="0" y="0"/>
+                      <a:ext cx="4476750" cy="5029200"/>
+                    </a:xfrm>
+                    <a:prstGeom prst="rect">
+                      <a:avLst/>
+                    </a:prstGeom>
+                  </pic:spPr>
+                </pic:pic>
+              </a:graphicData>
+            </a:graphic>
+          </wp:inline>
+        </w:drawing>
+      </w:r>
+    </w:p>
+    <w:p>
+      <w:pPr>
+        <w:spacing w:after="100"/>
+        <w:jc w:val="center"/>
+      </w:pPr>
+      <w:r>
+        <w:rPr>
+          <w:rFonts w:ascii="Calibri" w:cs="Calibri" w:eastAsia="Calibri" w:hAnsi="Calibri"/>
+          <w:i/>
+          <w:iCs/>
+          <w:color w:val="5B6675"/>
+          <w:sz w:val="14"/>
+          <w:szCs w:val="14"/>
+        </w:rPr>
+        <w:t xml:space="preserve">Figura 5. Despliegue en Vercel: proyecto asesoria-planes (Root Directory asesoria-planes, rama main, commit 3e2cf21) en estado Ready en https://asesoria-planes.vercel.app y respuesta de /api/health en producción.</w:t>
       </w:r>
     </w:p>
     <w:p>
@@ -4414,7 +4478,7 @@
       <w:r>
         <w:drawing>
           <wp:inline distT="0" distB="0" distL="0" distR="0">
-            <wp:extent cx="4953000" cy="1200150"/>
+            <wp:extent cx="3810000" cy="2867025"/>
             <wp:effectExtent t="0" r="0" b="0" l="0"/>
             <wp:docPr id="1" name="" descr="" title=""/>
             <wp:cNvGraphicFramePr>
@@ -4430,7 +4494,7 @@
                     </pic:cNvPicPr>
                   </pic:nvPicPr>
                   <pic:blipFill>
-                    <a:blip r:embed="rId13" cstate="none"/>
+                    <a:blip r:embed="rId14" cstate="none"/>
                     <a:srcRect/>
                     <a:stretch>
                       <a:fillRect/>
@@ -4439,7 +4503,7 @@
                   <pic:spPr bwMode="auto">
                     <a:xfrm>
                       <a:off x="0" y="0"/>
-                      <a:ext cx="4953000" cy="1200150"/>
+                      <a:ext cx="3810000" cy="2867025"/>
                     </a:xfrm>
                     <a:prstGeom prst="rect">
                       <a:avLst/>
@@ -4466,7 +4530,71 @@
           <w:sz w:val="14"/>
           <w:szCs w:val="14"/>
         </w:rPr>
-        <w:t xml:space="preserve">Figura 5. Ejecución del plan en TestSprite (captura pendiente; ver Anexo).</w:t>
+        <w:t xml:space="preserve">Figura 6. Integración con TestSprite: .cursor/mcp.json (servidor MCP), reglas del proyecto .cursor/rules y plan de pruebas testsprite_frontend_test_plan.json generado a partir del PRD.</w:t>
+      </w:r>
+    </w:p>
+    <w:p>
+      <w:pPr>
+        <w:keepNext/>
+        <w:spacing w:after="20" w:before="60"/>
+        <w:jc w:val="center"/>
+      </w:pPr>
+      <w:r>
+        <w:drawing>
+          <wp:inline distT="0" distB="0" distL="0" distR="0">
+            <wp:extent cx="4572000" cy="1114425"/>
+            <wp:effectExtent t="0" r="0" b="0" l="0"/>
+            <wp:docPr id="1" name="" descr="" title=""/>
+            <wp:cNvGraphicFramePr>
+              <a:graphicFrameLocks xmlns:a="http://schemas.openxmlformats.org/drawingml/2006/main" noChangeAspect="1"/>
+            </wp:cNvGraphicFramePr>
+            <a:graphic xmlns:a="http://schemas.openxmlformats.org/drawingml/2006/main">
+              <a:graphicData uri="http://schemas.openxmlformats.org/drawingml/2006/picture">
+                <pic:pic xmlns:pic="http://schemas.openxmlformats.org/drawingml/2006/picture">
+                  <pic:nvPicPr>
+                    <pic:cNvPr id="0" name="" descr=""/>
+                    <pic:cNvPicPr>
+                      <a:picLocks noChangeAspect="1" noChangeArrowheads="1"/>
+                    </pic:cNvPicPr>
+                  </pic:nvPicPr>
+                  <pic:blipFill>
+                    <a:blip r:embed="rId15" cstate="none"/>
+                    <a:srcRect/>
+                    <a:stretch>
+                      <a:fillRect/>
+                    </a:stretch>
+                  </pic:blipFill>
+                  <pic:spPr bwMode="auto">
+                    <a:xfrm>
+                      <a:off x="0" y="0"/>
+                      <a:ext cx="4572000" cy="1114425"/>
+                    </a:xfrm>
+                    <a:prstGeom prst="rect">
+                      <a:avLst/>
+                    </a:prstGeom>
+                  </pic:spPr>
+                </pic:pic>
+              </a:graphicData>
+            </a:graphic>
+          </wp:inline>
+        </w:drawing>
+      </w:r>
+    </w:p>
+    <w:p>
+      <w:pPr>
+        <w:spacing w:after="100"/>
+        <w:jc w:val="center"/>
+      </w:pPr>
+      <w:r>
+        <w:rPr>
+          <w:rFonts w:ascii="Calibri" w:cs="Calibri" w:eastAsia="Calibri" w:hAnsi="Calibri"/>
+          <w:i/>
+          <w:iCs/>
+          <w:color w:val="5B6675"/>
+          <w:sz w:val="14"/>
+          <w:szCs w:val="14"/>
+        </w:rPr>
+        <w:t xml:space="preserve">Figura 7. Ejecución del plan en TestSprite (captura pendiente; ver Anexo).</w:t>
       </w:r>
     </w:p>
     <w:p>
@@ -6067,7 +6195,7 @@
                     </pic:cNvPicPr>
                   </pic:nvPicPr>
                   <pic:blipFill>
-                    <a:blip r:embed="rId14" cstate="none"/>
+                    <a:blip r:embed="rId16" cstate="none"/>
                     <a:srcRect/>
                     <a:stretch>
                       <a:fillRect/>
@@ -6103,7 +6231,7 @@
           <w:sz w:val="14"/>
           <w:szCs w:val="14"/>
         </w:rPr>
-        <w:t xml:space="preserve">Figura 6. Primera ejecución del plan: 7 casos pasan, 5 fallan; se muestran las aserciones y errores de localización que originaron la revisión.</w:t>
+        <w:t xml:space="preserve">Figura 8. Primera ejecución del plan: 7 casos pasan, 5 fallan; se muestran las aserciones y errores de localización que originaron la revisión.</w:t>
       </w:r>
     </w:p>
     <w:p>
@@ -6131,7 +6259,7 @@
                     </pic:cNvPicPr>
                   </pic:nvPicPr>
                   <pic:blipFill>
-                    <a:blip r:embed="rId15" cstate="none"/>
+                    <a:blip r:embed="rId17" cstate="none"/>
                     <a:srcRect/>
                     <a:stretch>
                       <a:fillRect/>
@@ -6167,7 +6295,7 @@
           <w:sz w:val="14"/>
           <w:szCs w:val="14"/>
         </w:rPr>
-        <w:t xml:space="preserve">Figura 7. Ejecución final: 12/12 en 14 s y registro de las dos curaciones de localizadores (TC003 y TC006).</w:t>
+        <w:t xml:space="preserve">Figura 9. Ejecución final: 12/12 en 14 s y registro de las dos curaciones de localizadores (TC003 y TC006).</w:t>
       </w:r>
     </w:p>
     <w:p>
@@ -6195,7 +6323,7 @@
                     </pic:cNvPicPr>
                   </pic:nvPicPr>
                   <pic:blipFill>
-                    <a:blip r:embed="rId16" cstate="none"/>
+                    <a:blip r:embed="rId18" cstate="none"/>
                     <a:srcRect/>
                     <a:stretch>
                       <a:fillRect/>
@@ -6231,7 +6359,7 @@
           <w:sz w:val="14"/>
           <w:szCs w:val="14"/>
         </w:rPr>
-        <w:t xml:space="preserve">Figura 8. Reporte HTML de Playwright de la ejecución final (por archivo y caso, con duración).</w:t>
+        <w:t xml:space="preserve">Figura 10. Reporte HTML de Playwright de la ejecución final (por archivo y caso, con duración).</w:t>
       </w:r>
     </w:p>
     <w:p>
@@ -7720,7 +7848,7 @@
       <w:r>
         <w:drawing>
           <wp:inline distT="0" distB="0" distL="0" distR="0">
-            <wp:extent cx="4953000" cy="1200150"/>
+            <wp:extent cx="5905500" cy="1819275"/>
             <wp:effectExtent t="0" r="0" b="0" l="0"/>
             <wp:docPr id="1" name="" descr="" title=""/>
             <wp:cNvGraphicFramePr>
@@ -7736,7 +7864,7 @@
                     </pic:cNvPicPr>
                   </pic:nvPicPr>
                   <pic:blipFill>
-                    <a:blip r:embed="rId17" cstate="none"/>
+                    <a:blip r:embed="rId19" cstate="none"/>
                     <a:srcRect/>
                     <a:stretch>
                       <a:fillRect/>
@@ -7745,7 +7873,7 @@
                   <pic:spPr bwMode="auto">
                     <a:xfrm>
                       <a:off x="0" y="0"/>
-                      <a:ext cx="4953000" cy="1200150"/>
+                      <a:ext cx="5905500" cy="1819275"/>
                     </a:xfrm>
                     <a:prstGeom prst="rect">
                       <a:avLst/>
@@ -7772,7 +7900,7 @@
           <w:sz w:val="14"/>
           <w:szCs w:val="14"/>
         </w:rPr>
-        <w:t xml:space="preserve">Figura 9. Stripe Checkout en modo test sobre el despliegue (captura pendiente; ver Anexo).</w:t>
+        <w:t xml:space="preserve">Figura 11. Implementación del plan y del despliegue: tests/e2e/checkout.spec.ts (TC006–TC008 con heal()) y .github/workflows/deploy-planes.yml (job e2e como compuerta del deploy).</w:t>
       </w:r>
     </w:p>
     <w:p>
@@ -7784,7 +7912,7 @@
       <w:r>
         <w:drawing>
           <wp:inline distT="0" distB="0" distL="0" distR="0">
-            <wp:extent cx="4953000" cy="1200150"/>
+            <wp:extent cx="4572000" cy="1114425"/>
             <wp:effectExtent t="0" r="0" b="0" l="0"/>
             <wp:docPr id="1" name="" descr="" title=""/>
             <wp:cNvGraphicFramePr>
@@ -7800,7 +7928,7 @@
                     </pic:cNvPicPr>
                   </pic:nvPicPr>
                   <pic:blipFill>
-                    <a:blip r:embed="rId18" cstate="none"/>
+                    <a:blip r:embed="rId20" cstate="none"/>
                     <a:srcRect/>
                     <a:stretch>
                       <a:fillRect/>
@@ -7809,7 +7937,7 @@
                   <pic:spPr bwMode="auto">
                     <a:xfrm>
                       <a:off x="0" y="0"/>
-                      <a:ext cx="4953000" cy="1200150"/>
+                      <a:ext cx="4572000" cy="1114425"/>
                     </a:xfrm>
                     <a:prstGeom prst="rect">
                       <a:avLst/>
@@ -7836,7 +7964,71 @@
           <w:sz w:val="14"/>
           <w:szCs w:val="14"/>
         </w:rPr>
-        <w:t xml:space="preserve">Figura 10. Pipeline deploy-planes: E2E → Vercel → smoke (captura pendiente; ver Anexo).</w:t>
+        <w:t xml:space="preserve">Figura 12. Stripe Checkout en modo test sobre el despliegue (captura pendiente; ver Anexo).</w:t>
+      </w:r>
+    </w:p>
+    <w:p>
+      <w:pPr>
+        <w:keepNext/>
+        <w:spacing w:after="20" w:before="60"/>
+        <w:jc w:val="center"/>
+      </w:pPr>
+      <w:r>
+        <w:drawing>
+          <wp:inline distT="0" distB="0" distL="0" distR="0">
+            <wp:extent cx="4572000" cy="1114425"/>
+            <wp:effectExtent t="0" r="0" b="0" l="0"/>
+            <wp:docPr id="1" name="" descr="" title=""/>
+            <wp:cNvGraphicFramePr>
+              <a:graphicFrameLocks xmlns:a="http://schemas.openxmlformats.org/drawingml/2006/main" noChangeAspect="1"/>
+            </wp:cNvGraphicFramePr>
+            <a:graphic xmlns:a="http://schemas.openxmlformats.org/drawingml/2006/main">
+              <a:graphicData uri="http://schemas.openxmlformats.org/drawingml/2006/picture">
+                <pic:pic xmlns:pic="http://schemas.openxmlformats.org/drawingml/2006/picture">
+                  <pic:nvPicPr>
+                    <pic:cNvPr id="0" name="" descr=""/>
+                    <pic:cNvPicPr>
+                      <a:picLocks noChangeAspect="1" noChangeArrowheads="1"/>
+                    </pic:cNvPicPr>
+                  </pic:nvPicPr>
+                  <pic:blipFill>
+                    <a:blip r:embed="rId21" cstate="none"/>
+                    <a:srcRect/>
+                    <a:stretch>
+                      <a:fillRect/>
+                    </a:stretch>
+                  </pic:blipFill>
+                  <pic:spPr bwMode="auto">
+                    <a:xfrm>
+                      <a:off x="0" y="0"/>
+                      <a:ext cx="4572000" cy="1114425"/>
+                    </a:xfrm>
+                    <a:prstGeom prst="rect">
+                      <a:avLst/>
+                    </a:prstGeom>
+                  </pic:spPr>
+                </pic:pic>
+              </a:graphicData>
+            </a:graphic>
+          </wp:inline>
+        </w:drawing>
+      </w:r>
+    </w:p>
+    <w:p>
+      <w:pPr>
+        <w:spacing w:after="100"/>
+        <w:jc w:val="center"/>
+      </w:pPr>
+      <w:r>
+        <w:rPr>
+          <w:rFonts w:ascii="Calibri" w:cs="Calibri" w:eastAsia="Calibri" w:hAnsi="Calibri"/>
+          <w:i/>
+          <w:iCs/>
+          <w:color w:val="5B6675"/>
+          <w:sz w:val="14"/>
+          <w:szCs w:val="14"/>
+        </w:rPr>
+        <w:t xml:space="preserve">Figura 13. Pipeline deploy-planes: E2E → Vercel → smoke (captura pendiente; ver Anexo).</w:t>
       </w:r>
     </w:p>
     <w:p>
@@ -7919,7 +8111,7 @@
           <w:sz w:val="20"/>
           <w:szCs w:val="20"/>
         </w:rPr>
-        <w:t xml:space="preserve">Cursor: abrir asesoria-planes, revisar .cursor/rules y capturar el Composer (guía §1).</w:t>
+        <w:t xml:space="preserve">Hecho: proyecto generado y refinado en Cursor (Figuras 3, 4, 6, 11); despliegue en Vercel con proveedor mock en https://asesoria-planes.vercel.app (Figura 5).</w:t>
       </w:r>
     </w:p>
     <w:p>
@@ -7938,7 +8130,7 @@
           <w:sz w:val="20"/>
           <w:szCs w:val="20"/>
         </w:rPr>
-        <w:t xml:space="preserve">Stripe: crear claves de prueba y el webhook; configurar las variables en Vercel (guía §2–3).</w:t>
+        <w:t xml:space="preserve">Stripe: crear claves de prueba y el webhook; configurar STRIPE_SECRET_KEY, STRIPE_WEBHOOK_SECRET y PAYMENTS_PROVIDER=stripe en Vercel y redesplegar (guía §2–3).</w:t>
       </w:r>
     </w:p>
     <w:p>
@@ -7957,7 +8149,7 @@
           <w:sz w:val="20"/>
           <w:szCs w:val="20"/>
         </w:rPr>
-        <w:t xml:space="preserve">Vercel: importar el repositorio con Root Directory asesoria-planes; añadir VERCEL_TOKEN / ORG_ID / PROJECT_ID a GitHub para el workflow (guía §3).</w:t>
+        <w:t xml:space="preserve">GitHub: añadir VERCEL_TOKEN / VERCEL_ORG_ID / VERCEL_PROJECT_ID como secretos para que deploy-planes complete los jobs deploy y smoke-prod (guía §3).</w:t>
       </w:r>
     </w:p>
     <w:p>
@@ -7976,7 +8168,7 @@
           <w:sz w:val="20"/>
           <w:szCs w:val="20"/>
         </w:rPr>
-        <w:t xml:space="preserve">TestSprite: configurar el MCP con la API key y ejecutar el plan desde Cursor contra localhost (mock) y contra la URL de Vercel (guía §4); guardar testsprite-mcp-test-report.md y las capturas.</w:t>
+        <w:t xml:space="preserve">TestSprite: configurar el MCP con la API key y ejecutar el plan desde Cursor contra localhost:3001 (mock) y contra la URL de Vercel (guía §4); guardar testsprite-mcp-test-report.md y las capturas.</w:t>
       </w:r>
     </w:p>
     <w:p>
@@ -7995,7 +8187,7 @@
           <w:sz w:val="20"/>
           <w:szCs w:val="20"/>
         </w:rPr>
-        <w:t xml:space="preserve">Sustituir las figuras marcadas [PENDIENTE] por las capturas de Cursor, Vercel, Stripe, TestSprite y GitHub Actions, y añadir la comparación TestSprite vs. Playwright a la tabla de métricas.</w:t>
+        <w:t xml:space="preserve">Sustituir las figuras 7, 12 y 13 por las capturas de TestSprite, Stripe Checkout y GitHub Actions, y añadir la comparación TestSprite vs. Playwright a la tabla de métricas.</w:t>
       </w:r>
     </w:p>
     <w:sectPr>

</xml_diff>

<commit_message>
docs(u4): figura 13 con el pipeline deploy-planes #4 (e2e → Vercel → smoke) y evidencia de CI/SonarCloud
Co-Authored-By: Claude Fable 5.1 <noreply@anthropic.com>
Claude-Session: https://claude.ai/code/session_01CPmJiBWTMQ6Le4d6Lmujff
</commit_message>
<xml_diff>
--- a/docs/Informe_E2E_IA_TestSprite_AsesorIA_Unidad4.docx
+++ b/docs/Informe_E2E_IA_TestSprite_AsesorIA_Unidad4.docx
@@ -7976,7 +7976,7 @@
       <w:r>
         <w:drawing>
           <wp:inline distT="0" distB="0" distL="0" distR="0">
-            <wp:extent cx="4572000" cy="1114425"/>
+            <wp:extent cx="5905500" cy="1924050"/>
             <wp:effectExtent t="0" r="0" b="0" l="0"/>
             <wp:docPr id="1" name="" descr="" title=""/>
             <wp:cNvGraphicFramePr>
@@ -8001,7 +8001,7 @@
                   <pic:spPr bwMode="auto">
                     <a:xfrm>
                       <a:off x="0" y="0"/>
-                      <a:ext cx="4572000" cy="1114425"/>
+                      <a:ext cx="5905500" cy="1924050"/>
                     </a:xfrm>
                     <a:prstGeom prst="rect">
                       <a:avLst/>
@@ -8028,7 +8028,7 @@
           <w:sz w:val="14"/>
           <w:szCs w:val="14"/>
         </w:rPr>
-        <w:t xml:space="preserve">Figura 13. Pipeline deploy-planes: E2E → Vercel → smoke (captura pendiente; ver Anexo).</w:t>
+        <w:t xml:space="preserve">Figura 13. Pipeline deploy-planes #4 en GitHub Actions: Build + E2E (12/12, 1m 21s) → Deploy a Vercel (47 s) → Smoke en producción contra asesoria-planes.vercel.app (46 s). Status: Success.</w:t>
       </w:r>
     </w:p>
     <w:p>
@@ -8149,7 +8149,7 @@
           <w:sz w:val="20"/>
           <w:szCs w:val="20"/>
         </w:rPr>
-        <w:t xml:space="preserve">GitHub: añadir VERCEL_TOKEN / VERCEL_ORG_ID / VERCEL_PROJECT_ID como secretos para que deploy-planes complete los jobs deploy y smoke-prod (guía §3).</w:t>
+        <w:t xml:space="preserve">Hecho: secretos VERCEL_* en GitHub; deploy-planes #4 completo (e2e → deploy → smoke) en verde (Figura 13); pipeline ci #7 con SonarCloud quality gate Passed.</w:t>
       </w:r>
     </w:p>
     <w:p>
@@ -8187,7 +8187,7 @@
           <w:sz w:val="20"/>
           <w:szCs w:val="20"/>
         </w:rPr>
-        <w:t xml:space="preserve">Sustituir las figuras 7, 12 y 13 por las capturas de TestSprite, Stripe Checkout y GitHub Actions, y añadir la comparación TestSprite vs. Playwright a la tabla de métricas.</w:t>
+        <w:t xml:space="preserve">Sustituir las figuras 7 y 12 por las capturas de TestSprite y Stripe Checkout, y añadir la comparación TestSprite vs. Playwright a la tabla de métricas.</w:t>
       </w:r>
     </w:p>
     <w:sectPr>

</xml_diff>

<commit_message>
docs(u4): sección TestSprite con ejecución real en la nube (figuras 7/7b, revisión de hallazgos, comparación con Playwright) y reporte de ejecución
Co-Authored-By: Claude Fable 5.1 <noreply@anthropic.com>
Claude-Session: https://claude.ai/code/session_01CPmJiBWTMQ6Le4d6Lmujff
</commit_message>
<xml_diff>
--- a/docs/Informe_E2E_IA_TestSprite_AsesorIA_Unidad4.docx
+++ b/docs/Informe_E2E_IA_TestSprite_AsesorIA_Unidad4.docx
@@ -4542,7 +4542,7 @@
       <w:r>
         <w:drawing>
           <wp:inline distT="0" distB="0" distL="0" distR="0">
-            <wp:extent cx="4572000" cy="1114425"/>
+            <wp:extent cx="5905500" cy="2038350"/>
             <wp:effectExtent t="0" r="0" b="0" l="0"/>
             <wp:docPr id="1" name="" descr="" title=""/>
             <wp:cNvGraphicFramePr>
@@ -4567,7 +4567,7 @@
                   <pic:spPr bwMode="auto">
                     <a:xfrm>
                       <a:off x="0" y="0"/>
-                      <a:ext cx="4572000" cy="1114425"/>
+                      <a:ext cx="5905500" cy="2038350"/>
                     </a:xfrm>
                     <a:prstGeom prst="rect">
                       <a:avLst/>
@@ -4594,7 +4594,71 @@
           <w:sz w:val="14"/>
           <w:szCs w:val="14"/>
         </w:rPr>
-        <w:t xml:space="preserve">Figura 7. Ejecución del plan en TestSprite (captura pendiente; ver Anexo).</w:t>
+        <w:t xml:space="preserve">Figura 7. TestSprite sobre el despliegue: exploración autónoma (3 páginas, 53 s) y resultados de la ejecución en la nube (11 pruebas: 9 pasan, 1 falla, 1 bloqueada; pass rate 82 %).</w:t>
+      </w:r>
+    </w:p>
+    <w:p>
+      <w:pPr>
+        <w:keepNext/>
+        <w:spacing w:after="20" w:before="60"/>
+        <w:jc w:val="center"/>
+      </w:pPr>
+      <w:r>
+        <w:drawing>
+          <wp:inline distT="0" distB="0" distL="0" distR="0">
+            <wp:extent cx="4953000" cy="1543050"/>
+            <wp:effectExtent t="0" r="0" b="0" l="0"/>
+            <wp:docPr id="1" name="" descr="" title=""/>
+            <wp:cNvGraphicFramePr>
+              <a:graphicFrameLocks xmlns:a="http://schemas.openxmlformats.org/drawingml/2006/main" noChangeAspect="1"/>
+            </wp:cNvGraphicFramePr>
+            <a:graphic xmlns:a="http://schemas.openxmlformats.org/drawingml/2006/main">
+              <a:graphicData uri="http://schemas.openxmlformats.org/drawingml/2006/picture">
+                <pic:pic xmlns:pic="http://schemas.openxmlformats.org/drawingml/2006/picture">
+                  <pic:nvPicPr>
+                    <pic:cNvPr id="0" name="" descr=""/>
+                    <pic:cNvPicPr>
+                      <a:picLocks noChangeAspect="1" noChangeArrowheads="1"/>
+                    </pic:cNvPicPr>
+                  </pic:nvPicPr>
+                  <pic:blipFill>
+                    <a:blip r:embed="rId16" cstate="none"/>
+                    <a:srcRect/>
+                    <a:stretch>
+                      <a:fillRect/>
+                    </a:stretch>
+                  </pic:blipFill>
+                  <pic:spPr bwMode="auto">
+                    <a:xfrm>
+                      <a:off x="0" y="0"/>
+                      <a:ext cx="4953000" cy="1543050"/>
+                    </a:xfrm>
+                    <a:prstGeom prst="rect">
+                      <a:avLst/>
+                    </a:prstGeom>
+                  </pic:spPr>
+                </pic:pic>
+              </a:graphicData>
+            </a:graphic>
+          </wp:inline>
+        </w:drawing>
+      </w:r>
+    </w:p>
+    <w:p>
+      <w:pPr>
+        <w:spacing w:after="100"/>
+        <w:jc w:val="center"/>
+      </w:pPr>
+      <w:r>
+        <w:rPr>
+          <w:rFonts w:ascii="Calibri" w:cs="Calibri" w:eastAsia="Calibri" w:hAnsi="Calibri"/>
+          <w:i/>
+          <w:iCs/>
+          <w:color w:val="5B6675"/>
+          <w:sz w:val="14"/>
+          <w:szCs w:val="14"/>
+        </w:rPr>
+        <w:t xml:space="preserve">Figura 7b. Diagnóstico generado por TestSprite para el fallo (causa raíz propuesta) con las acciones Re-run y Copy Fix Prompt (self-healing asistido por IA).</w:t>
       </w:r>
     </w:p>
     <w:p>
@@ -6169,6 +6233,341 @@
           </w:p>
         </w:tc>
       </w:tr>
+      <w:tr>
+        <w:trPr>
+          <w:cantSplit/>
+        </w:trPr>
+        <w:tc>
+          <w:tcPr>
+            <w:tcW w:type="dxa" w:w="1024"/>
+            <w:tcBorders>
+              <w:top w:val="single" w:color="C9D2DE" w:sz="4"/>
+              <w:left w:val="single" w:color="C9D2DE" w:sz="4"/>
+              <w:bottom w:val="single" w:color="C9D2DE" w:sz="4"/>
+              <w:right w:val="single" w:color="C9D2DE" w:sz="4"/>
+            </w:tcBorders>
+            <w:tcMar>
+              <w:top w:type="dxa" w:w="15"/>
+              <w:left w:type="dxa" w:w="55"/>
+              <w:bottom w:type="dxa" w:w="15"/>
+              <w:right w:type="dxa" w:w="55"/>
+            </w:tcMar>
+            <w:vAlign w:val="center"/>
+          </w:tcPr>
+          <w:p>
+            <w:pPr>
+              <w:spacing w:after="0" w:line="240"/>
+              <w:jc w:val="left"/>
+            </w:pPr>
+            <w:r>
+              <w:rPr>
+                <w:rFonts w:ascii="Calibri" w:cs="Calibri" w:eastAsia="Calibri" w:hAnsi="Calibri"/>
+                <w:sz w:val="16"/>
+                <w:szCs w:val="16"/>
+              </w:rPr>
+              <w:t xml:space="preserve">TS · Cancelar y reintentar</w:t>
+            </w:r>
+          </w:p>
+        </w:tc>
+        <w:tc>
+          <w:tcPr>
+            <w:tcW w:type="dxa" w:w="1434"/>
+            <w:tcBorders>
+              <w:top w:val="single" w:color="C9D2DE" w:sz="4"/>
+              <w:left w:val="single" w:color="C9D2DE" w:sz="4"/>
+              <w:bottom w:val="single" w:color="C9D2DE" w:sz="4"/>
+              <w:right w:val="single" w:color="C9D2DE" w:sz="4"/>
+            </w:tcBorders>
+            <w:tcMar>
+              <w:top w:type="dxa" w:w="15"/>
+              <w:left w:type="dxa" w:w="55"/>
+              <w:bottom w:type="dxa" w:w="15"/>
+              <w:right w:type="dxa" w:w="55"/>
+            </w:tcMar>
+            <w:vAlign w:val="center"/>
+          </w:tcPr>
+          <w:p>
+            <w:pPr>
+              <w:spacing w:after="0" w:line="240"/>
+              <w:jc w:val="left"/>
+            </w:pPr>
+            <w:r>
+              <w:rPr>
+                <w:rFonts w:ascii="Calibri" w:cs="Calibri" w:eastAsia="Calibri" w:hAnsi="Calibri"/>
+                <w:sz w:val="16"/>
+                <w:szCs w:val="16"/>
+              </w:rPr>
+              <w:t xml:space="preserve">✘ (TestSprite)</w:t>
+            </w:r>
+          </w:p>
+        </w:tc>
+        <w:tc>
+          <w:tcPr>
+            <w:tcW w:type="dxa" w:w="4096"/>
+            <w:tcBorders>
+              <w:top w:val="single" w:color="C9D2DE" w:sz="4"/>
+              <w:left w:val="single" w:color="C9D2DE" w:sz="4"/>
+              <w:bottom w:val="single" w:color="C9D2DE" w:sz="4"/>
+              <w:right w:val="single" w:color="C9D2DE" w:sz="4"/>
+            </w:tcBorders>
+            <w:tcMar>
+              <w:top w:type="dxa" w:w="15"/>
+              <w:left w:type="dxa" w:w="55"/>
+              <w:bottom w:type="dxa" w:w="15"/>
+              <w:right w:type="dxa" w:w="55"/>
+            </w:tcMar>
+            <w:vAlign w:val="center"/>
+          </w:tcPr>
+          <w:p>
+            <w:pPr>
+              <w:spacing w:after="0" w:line="240"/>
+              <w:jc w:val="left"/>
+            </w:pPr>
+            <w:r>
+              <w:rPr>
+                <w:rFonts w:ascii="Calibri" w:cs="Calibri" w:eastAsia="Calibri" w:hAnsi="Calibri"/>
+                <w:sz w:val="16"/>
+                <w:szCs w:val="16"/>
+              </w:rPr>
+              <w:t xml:space="preserve">Defecto real: la pasarela mock redirigía a /cancelado sin plan y «Reintentar» caía en /planes; TC008 propio lo toleraba (expectativa laxa)</w:t>
+            </w:r>
+          </w:p>
+        </w:tc>
+        <w:tc>
+          <w:tcPr>
+            <w:tcW w:type="dxa" w:w="2867"/>
+            <w:tcBorders>
+              <w:top w:val="single" w:color="C9D2DE" w:sz="4"/>
+              <w:left w:val="single" w:color="C9D2DE" w:sz="4"/>
+              <w:bottom w:val="single" w:color="C9D2DE" w:sz="4"/>
+              <w:right w:val="single" w:color="C9D2DE" w:sz="4"/>
+            </w:tcBorders>
+            <w:tcMar>
+              <w:top w:type="dxa" w:w="15"/>
+              <w:left w:type="dxa" w:w="55"/>
+              <w:bottom w:type="dxa" w:w="15"/>
+              <w:right w:type="dxa" w:w="55"/>
+            </w:tcMar>
+            <w:vAlign w:val="center"/>
+          </w:tcPr>
+          <w:p>
+            <w:pPr>
+              <w:spacing w:after="0" w:line="240"/>
+              <w:jc w:val="left"/>
+            </w:pPr>
+            <w:r>
+              <w:rPr>
+                <w:rFonts w:ascii="Calibri" w:cs="Calibri" w:eastAsia="Calibri" w:hAnsi="Calibri"/>
+                <w:sz w:val="16"/>
+                <w:szCs w:val="16"/>
+              </w:rPr>
+              <w:t xml:space="preserve">MockGateway conserva el plan; TC008 exige /checkout?plan=…; re-run en TestSprite</w:t>
+            </w:r>
+          </w:p>
+        </w:tc>
+        <w:tc>
+          <w:tcPr>
+            <w:tcW w:type="dxa" w:w="819"/>
+            <w:tcBorders>
+              <w:top w:val="single" w:color="C9D2DE" w:sz="4"/>
+              <w:left w:val="single" w:color="C9D2DE" w:sz="4"/>
+              <w:bottom w:val="single" w:color="C9D2DE" w:sz="4"/>
+              <w:right w:val="single" w:color="C9D2DE" w:sz="4"/>
+            </w:tcBorders>
+            <w:tcMar>
+              <w:top w:type="dxa" w:w="15"/>
+              <w:left w:type="dxa" w:w="55"/>
+              <w:bottom w:type="dxa" w:w="15"/>
+              <w:right w:type="dxa" w:w="55"/>
+            </w:tcMar>
+            <w:vAlign w:val="center"/>
+          </w:tcPr>
+          <w:p>
+            <w:pPr>
+              <w:spacing w:after="0" w:line="240"/>
+              <w:jc w:val="left"/>
+            </w:pPr>
+            <w:r>
+              <w:rPr>
+                <w:rFonts w:ascii="Calibri" w:cs="Calibri" w:eastAsia="Calibri" w:hAnsi="Calibri"/>
+                <w:sz w:val="16"/>
+                <w:szCs w:val="16"/>
+              </w:rPr>
+              <w:t xml:space="preserve">✓</w:t>
+            </w:r>
+          </w:p>
+        </w:tc>
+      </w:tr>
+      <w:tr>
+        <w:trPr>
+          <w:cantSplit/>
+        </w:trPr>
+        <w:tc>
+          <w:tcPr>
+            <w:tcW w:type="dxa" w:w="1024"/>
+            <w:tcBorders>
+              <w:top w:val="single" w:color="C9D2DE" w:sz="4"/>
+              <w:left w:val="single" w:color="C9D2DE" w:sz="4"/>
+              <w:bottom w:val="single" w:color="C9D2DE" w:sz="4"/>
+              <w:right w:val="single" w:color="C9D2DE" w:sz="4"/>
+            </w:tcBorders>
+            <w:shd w:fill="F6F8FB" w:color="auto" w:val="clear"/>
+            <w:tcMar>
+              <w:top w:type="dxa" w:w="15"/>
+              <w:left w:type="dxa" w:w="55"/>
+              <w:bottom w:type="dxa" w:w="15"/>
+              <w:right w:type="dxa" w:w="55"/>
+            </w:tcMar>
+            <w:vAlign w:val="center"/>
+          </w:tcPr>
+          <w:p>
+            <w:pPr>
+              <w:spacing w:after="0" w:line="240"/>
+              <w:jc w:val="left"/>
+            </w:pPr>
+            <w:r>
+              <w:rPr>
+                <w:rFonts w:ascii="Calibri" w:cs="Calibri" w:eastAsia="Calibri" w:hAnsi="Calibri"/>
+                <w:sz w:val="16"/>
+                <w:szCs w:val="16"/>
+              </w:rPr>
+              <w:t xml:space="preserve">TS · Activar sin pago</w:t>
+            </w:r>
+          </w:p>
+        </w:tc>
+        <w:tc>
+          <w:tcPr>
+            <w:tcW w:type="dxa" w:w="1434"/>
+            <w:tcBorders>
+              <w:top w:val="single" w:color="C9D2DE" w:sz="4"/>
+              <w:left w:val="single" w:color="C9D2DE" w:sz="4"/>
+              <w:bottom w:val="single" w:color="C9D2DE" w:sz="4"/>
+              <w:right w:val="single" w:color="C9D2DE" w:sz="4"/>
+            </w:tcBorders>
+            <w:shd w:fill="F6F8FB" w:color="auto" w:val="clear"/>
+            <w:tcMar>
+              <w:top w:type="dxa" w:w="15"/>
+              <w:left w:type="dxa" w:w="55"/>
+              <w:bottom w:type="dxa" w:w="15"/>
+              <w:right w:type="dxa" w:w="55"/>
+            </w:tcMar>
+            <w:vAlign w:val="center"/>
+          </w:tcPr>
+          <w:p>
+            <w:pPr>
+              <w:spacing w:after="0" w:line="240"/>
+              <w:jc w:val="left"/>
+            </w:pPr>
+            <w:r>
+              <w:rPr>
+                <w:rFonts w:ascii="Calibri" w:cs="Calibri" w:eastAsia="Calibri" w:hAnsi="Calibri"/>
+                <w:sz w:val="16"/>
+                <w:szCs w:val="16"/>
+              </w:rPr>
+              <w:t xml:space="preserve">⊘ bloqueada</w:t>
+            </w:r>
+          </w:p>
+        </w:tc>
+        <w:tc>
+          <w:tcPr>
+            <w:tcW w:type="dxa" w:w="4096"/>
+            <w:tcBorders>
+              <w:top w:val="single" w:color="C9D2DE" w:sz="4"/>
+              <w:left w:val="single" w:color="C9D2DE" w:sz="4"/>
+              <w:bottom w:val="single" w:color="C9D2DE" w:sz="4"/>
+              <w:right w:val="single" w:color="C9D2DE" w:sz="4"/>
+            </w:tcBorders>
+            <w:shd w:fill="F6F8FB" w:color="auto" w:val="clear"/>
+            <w:tcMar>
+              <w:top w:type="dxa" w:w="15"/>
+              <w:left w:type="dxa" w:w="55"/>
+              <w:bottom w:type="dxa" w:w="15"/>
+              <w:right w:type="dxa" w:w="55"/>
+            </w:tcMar>
+            <w:vAlign w:val="center"/>
+          </w:tcPr>
+          <w:p>
+            <w:pPr>
+              <w:spacing w:after="0" w:line="240"/>
+              <w:jc w:val="left"/>
+            </w:pPr>
+            <w:r>
+              <w:rPr>
+                <w:rFonts w:ascii="Calibri" w:cs="Calibri" w:eastAsia="Calibri" w:hAnsi="Calibri"/>
+                <w:sz w:val="16"/>
+                <w:szCs w:val="16"/>
+              </w:rPr>
+              <w:t xml:space="preserve">Limitación del agente UI: el control vive en la API (POST /api/activar → 402); el agente hizo GET → 405. Su sugerencia (exponer activación en /exito) se descartó por seguridad</w:t>
+            </w:r>
+          </w:p>
+        </w:tc>
+        <w:tc>
+          <w:tcPr>
+            <w:tcW w:type="dxa" w:w="2867"/>
+            <w:tcBorders>
+              <w:top w:val="single" w:color="C9D2DE" w:sz="4"/>
+              <w:left w:val="single" w:color="C9D2DE" w:sz="4"/>
+              <w:bottom w:val="single" w:color="C9D2DE" w:sz="4"/>
+              <w:right w:val="single" w:color="C9D2DE" w:sz="4"/>
+            </w:tcBorders>
+            <w:shd w:fill="F6F8FB" w:color="auto" w:val="clear"/>
+            <w:tcMar>
+              <w:top w:type="dxa" w:w="15"/>
+              <w:left w:type="dxa" w:w="55"/>
+              <w:bottom w:type="dxa" w:w="15"/>
+              <w:right w:type="dxa" w:w="55"/>
+            </w:tcMar>
+            <w:vAlign w:val="center"/>
+          </w:tcPr>
+          <w:p>
+            <w:pPr>
+              <w:spacing w:after="0" w:line="240"/>
+              <w:jc w:val="left"/>
+            </w:pPr>
+            <w:r>
+              <w:rPr>
+                <w:rFonts w:ascii="Calibri" w:cs="Calibri" w:eastAsia="Calibri" w:hAnsi="Calibri"/>
+                <w:sz w:val="16"/>
+                <w:szCs w:val="16"/>
+              </w:rPr>
+              <w:t xml:space="preserve">Cubierto por TC010/TC011 a nivel API; falso positivo documentado</w:t>
+            </w:r>
+          </w:p>
+        </w:tc>
+        <w:tc>
+          <w:tcPr>
+            <w:tcW w:type="dxa" w:w="819"/>
+            <w:tcBorders>
+              <w:top w:val="single" w:color="C9D2DE" w:sz="4"/>
+              <w:left w:val="single" w:color="C9D2DE" w:sz="4"/>
+              <w:bottom w:val="single" w:color="C9D2DE" w:sz="4"/>
+              <w:right w:val="single" w:color="C9D2DE" w:sz="4"/>
+            </w:tcBorders>
+            <w:shd w:fill="F6F8FB" w:color="auto" w:val="clear"/>
+            <w:tcMar>
+              <w:top w:type="dxa" w:w="15"/>
+              <w:left w:type="dxa" w:w="55"/>
+              <w:bottom w:type="dxa" w:w="15"/>
+              <w:right w:type="dxa" w:w="55"/>
+            </w:tcMar>
+            <w:vAlign w:val="center"/>
+          </w:tcPr>
+          <w:p>
+            <w:pPr>
+              <w:spacing w:after="0" w:line="240"/>
+              <w:jc w:val="left"/>
+            </w:pPr>
+            <w:r>
+              <w:rPr>
+                <w:rFonts w:ascii="Calibri" w:cs="Calibri" w:eastAsia="Calibri" w:hAnsi="Calibri"/>
+                <w:sz w:val="16"/>
+                <w:szCs w:val="16"/>
+              </w:rPr>
+              <w:t xml:space="preserve">⊘</w:t>
+            </w:r>
+          </w:p>
+        </w:tc>
+      </w:tr>
     </w:tbl>
     <w:p>
       <w:pPr>
@@ -6195,7 +6594,7 @@
                     </pic:cNvPicPr>
                   </pic:nvPicPr>
                   <pic:blipFill>
-                    <a:blip r:embed="rId16" cstate="none"/>
+                    <a:blip r:embed="rId17" cstate="none"/>
                     <a:srcRect/>
                     <a:stretch>
                       <a:fillRect/>
@@ -6259,7 +6658,7 @@
                     </pic:cNvPicPr>
                   </pic:nvPicPr>
                   <pic:blipFill>
-                    <a:blip r:embed="rId17" cstate="none"/>
+                    <a:blip r:embed="rId18" cstate="none"/>
                     <a:srcRect/>
                     <a:stretch>
                       <a:fillRect/>
@@ -6323,7 +6722,7 @@
                     </pic:cNvPicPr>
                   </pic:nvPicPr>
                   <pic:blipFill>
-                    <a:blip r:embed="rId18" cstate="none"/>
+                    <a:blip r:embed="rId19" cstate="none"/>
                     <a:srcRect/>
                     <a:stretch>
                       <a:fillRect/>
@@ -6747,7 +7146,7 @@
                 <w:sz w:val="16"/>
                 <w:szCs w:val="16"/>
               </w:rPr>
-              <w:t xml:space="preserve">1 defecto de producto (TC007) · 3 expectativas incorrectas de prueba · 1 localizador ambiguo · 2 localizadores obsoletos auto-curados</w:t>
+              <w:t xml:space="preserve">2 defectos de producto (TC007 cabecera; cancelación sin plan, hallado por TestSprite) · 3 expectativas incorrectas · 1 expectativa laxa (TC008) · 1 localizador ambiguo · 2 localizadores obsoletos auto-curados</w:t>
             </w:r>
           </w:p>
         </w:tc>
@@ -6924,6 +7323,76 @@
                 <w:sz w:val="16"/>
                 <w:szCs w:val="16"/>
               </w:rPr>
+              <w:t xml:space="preserve">TestSprite (nube, sobre Vercel)</w:t>
+            </w:r>
+          </w:p>
+        </w:tc>
+        <w:tc>
+          <w:tcPr>
+            <w:tcW w:type="dxa" w:w="6554"/>
+            <w:tcBorders>
+              <w:top w:val="single" w:color="C9D2DE" w:sz="4"/>
+              <w:left w:val="single" w:color="C9D2DE" w:sz="4"/>
+              <w:bottom w:val="single" w:color="C9D2DE" w:sz="4"/>
+              <w:right w:val="single" w:color="C9D2DE" w:sz="4"/>
+            </w:tcBorders>
+            <w:tcMar>
+              <w:top w:type="dxa" w:w="15"/>
+              <w:left w:type="dxa" w:w="55"/>
+              <w:bottom w:type="dxa" w:w="15"/>
+              <w:right w:type="dxa" w:w="55"/>
+            </w:tcMar>
+            <w:vAlign w:val="center"/>
+          </w:tcPr>
+          <w:p>
+            <w:pPr>
+              <w:spacing w:after="0" w:line="240"/>
+              <w:jc w:val="left"/>
+            </w:pPr>
+            <w:r>
+              <w:rPr>
+                <w:rFonts w:ascii="Calibri" w:cs="Calibri" w:eastAsia="Calibri" w:hAnsi="Calibri"/>
+                <w:sz w:val="16"/>
+                <w:szCs w:val="16"/>
+              </w:rPr>
+              <w:t xml:space="preserve">Plan generado: 43 casos / 6 casos de uso (redundante) → 11 únicos ejecutados · 1.ª ejecución 9/11 pasan, 1 falla (defecto real), 1 bloqueada · re-run tras el fix: 1/1 pasa + 1 bloqueada por diseño</w:t>
+            </w:r>
+          </w:p>
+        </w:tc>
+      </w:tr>
+      <w:tr>
+        <w:trPr>
+          <w:cantSplit/>
+        </w:trPr>
+        <w:tc>
+          <w:tcPr>
+            <w:tcW w:type="dxa" w:w="3686"/>
+            <w:tcBorders>
+              <w:top w:val="single" w:color="C9D2DE" w:sz="4"/>
+              <w:left w:val="single" w:color="C9D2DE" w:sz="4"/>
+              <w:bottom w:val="single" w:color="C9D2DE" w:sz="4"/>
+              <w:right w:val="single" w:color="C9D2DE" w:sz="4"/>
+            </w:tcBorders>
+            <w:shd w:fill="F6F8FB" w:color="auto" w:val="clear"/>
+            <w:tcMar>
+              <w:top w:type="dxa" w:w="15"/>
+              <w:left w:type="dxa" w:w="55"/>
+              <w:bottom w:type="dxa" w:w="15"/>
+              <w:right w:type="dxa" w:w="55"/>
+            </w:tcMar>
+            <w:vAlign w:val="center"/>
+          </w:tcPr>
+          <w:p>
+            <w:pPr>
+              <w:spacing w:after="0" w:line="240"/>
+              <w:jc w:val="left"/>
+            </w:pPr>
+            <w:r>
+              <w:rPr>
+                <w:rFonts w:ascii="Calibri" w:cs="Calibri" w:eastAsia="Calibri" w:hAnsi="Calibri"/>
+                <w:sz w:val="16"/>
+                <w:szCs w:val="16"/>
+              </w:rPr>
               <w:t xml:space="preserve">Evidencia por caso</w:t>
             </w:r>
           </w:p>
@@ -6937,26 +7406,27 @@
               <w:bottom w:val="single" w:color="C9D2DE" w:sz="4"/>
               <w:right w:val="single" w:color="C9D2DE" w:sz="4"/>
             </w:tcBorders>
-            <w:tcMar>
-              <w:top w:type="dxa" w:w="15"/>
-              <w:left w:type="dxa" w:w="55"/>
-              <w:bottom w:type="dxa" w:w="15"/>
-              <w:right w:type="dxa" w:w="55"/>
-            </w:tcMar>
-            <w:vAlign w:val="center"/>
-          </w:tcPr>
-          <w:p>
-            <w:pPr>
-              <w:spacing w:after="0" w:line="240"/>
-              <w:jc w:val="left"/>
-            </w:pPr>
-            <w:r>
-              <w:rPr>
-                <w:rFonts w:ascii="Calibri" w:cs="Calibri" w:eastAsia="Calibri" w:hAnsi="Calibri"/>
-                <w:sz w:val="16"/>
-                <w:szCs w:val="16"/>
-              </w:rPr>
-              <w:t xml:space="preserve">Reporte HTML, traza y video en fallo, capturas de TC006/TC007, registro de curaciones</w:t>
+            <w:shd w:fill="F6F8FB" w:color="auto" w:val="clear"/>
+            <w:tcMar>
+              <w:top w:type="dxa" w:w="15"/>
+              <w:left w:type="dxa" w:w="55"/>
+              <w:bottom w:type="dxa" w:w="15"/>
+              <w:right w:type="dxa" w:w="55"/>
+            </w:tcMar>
+            <w:vAlign w:val="center"/>
+          </w:tcPr>
+          <w:p>
+            <w:pPr>
+              <w:spacing w:after="0" w:line="240"/>
+              <w:jc w:val="left"/>
+            </w:pPr>
+            <w:r>
+              <w:rPr>
+                <w:rFonts w:ascii="Calibri" w:cs="Calibri" w:eastAsia="Calibri" w:hAnsi="Calibri"/>
+                <w:sz w:val="16"/>
+                <w:szCs w:val="16"/>
+              </w:rPr>
+              <w:t xml:space="preserve">Reporte HTML, traza y video en fallo, capturas de TC006/TC007, registro de curaciones; videos y reporte de TestSprite (testsprite_tests/testsprite-report-ejecucion-cloud.md)</w:t>
             </w:r>
           </w:p>
         </w:tc>
@@ -7864,7 +8334,7 @@
                     </pic:cNvPicPr>
                   </pic:nvPicPr>
                   <pic:blipFill>
-                    <a:blip r:embed="rId19" cstate="none"/>
+                    <a:blip r:embed="rId20" cstate="none"/>
                     <a:srcRect/>
                     <a:stretch>
                       <a:fillRect/>
@@ -7928,7 +8398,7 @@
                     </pic:cNvPicPr>
                   </pic:nvPicPr>
                   <pic:blipFill>
-                    <a:blip r:embed="rId20" cstate="none"/>
+                    <a:blip r:embed="rId21" cstate="none"/>
                     <a:srcRect/>
                     <a:stretch>
                       <a:fillRect/>
@@ -7992,7 +8462,7 @@
                     </pic:cNvPicPr>
                   </pic:nvPicPr>
                   <pic:blipFill>
-                    <a:blip r:embed="rId21" cstate="none"/>
+                    <a:blip r:embed="rId22" cstate="none"/>
                     <a:srcRect/>
                     <a:stretch>
                       <a:fillRect/>
@@ -8074,7 +8544,7 @@
           <w:sz w:val="20"/>
           <w:szCs w:val="20"/>
         </w:rPr>
-        <w:t xml:space="preserve">Las técnicas de auto-curación reducen el mantenimiento, pero deben ser auditables: el helper registra cada curación y la CI la publica, de modo que una curación no oculte un cambio funcional. En un contexto bancario esto importa tanto como la cobertura: una prueba que «se cura sola» sin dejar rastro es un control que ya no verifica lo que decía verificar. La integración con TestSprite aporta el siguiente nivel (generación, ejecución en la nube y propuesta de corrección), y la arquitectura del MVP está lista para ejecutarla contra el despliegue en Vercel con Stripe en modo test.</w:t>
+        <w:t xml:space="preserve">Las técnicas de auto-curación reducen el mantenimiento, pero deben ser auditables: el helper registra cada curación y la CI la publica, de modo que una curación no oculte un cambio funcional. En un contexto bancario esto importa tanto como la cobertura: una prueba que «se cura sola» sin dejar rastro es un control que ya no verifica lo que decía verificar. La ejecución de TestSprite contra el despliegue en Vercel confirmó el valor complementario de un agente exploratorio: generó un plan amplio pero redundante (43 casos que se depuraron a 11), encontró un defecto real que la suite propia toleraba (el reintento tras cancelar perdía el plan) y propuso un fix prompt que se aplicó y verificó con un re-run; a la vez, su diagnóstico del caso bloqueado proponía exponer la activación sin pago, una sugerencia que habría introducido una vulnerabilidad y que la revisión humana descartó. La combinación recomendada es usar el agente para descubrir y la suite determinista como compuerta del despliegue.</w:t>
       </w:r>
     </w:p>
     <w:p>
@@ -8168,7 +8638,7 @@
           <w:sz w:val="20"/>
           <w:szCs w:val="20"/>
         </w:rPr>
-        <w:t xml:space="preserve">TestSprite: configurar el MCP con la API key y ejecutar el plan desde Cursor contra localhost:3001 (mock) y contra la URL de Vercel (guía §4); guardar testsprite-mcp-test-report.md y las capturas.</w:t>
+        <w:t xml:space="preserve">Hecho: TestSprite ejecutado desde su portal contra https://asesoria-planes.vercel.app (proyecto «AsesorIA Planes (Unidad 4)», PRD cargado): exploración, plan de 43 casos depurado a 11, dos ejecuciones y fix prompt (Figuras 7 y 7b; detalle en testsprite_tests/testsprite-report-ejecucion-cloud.md).</w:t>
       </w:r>
     </w:p>
     <w:p>
@@ -8187,7 +8657,7 @@
           <w:sz w:val="20"/>
           <w:szCs w:val="20"/>
         </w:rPr>
-        <w:t xml:space="preserve">Sustituir las figuras 7 y 12 por las capturas de TestSprite y Stripe Checkout, y añadir la comparación TestSprite vs. Playwright a la tabla de métricas.</w:t>
+        <w:t xml:space="preserve">Sustituir la figura 12 por la captura de Stripe Checkout en modo test, y añadir la comparación TestSprite vs. Playwright a la tabla de métricas.</w:t>
       </w:r>
     </w:p>
     <w:sectPr>

</xml_diff>

<commit_message>
docs(u4): figura 12 con la pasarela desplegada, Test Report de TestSprite y Anexo B con la galería completa de capturas (Vercel, Cursor, TestSprite, Actions, SonarCloud)
Co-Authored-By: Claude Fable 5.1 <noreply@anthropic.com>
Claude-Session: https://claude.ai/code/session_01CPmJiBWTMQ6Le4d6Lmujff
</commit_message>
<xml_diff>
--- a/docs/Informe_E2E_IA_TestSprite_AsesorIA_Unidad4.docx
+++ b/docs/Informe_E2E_IA_TestSprite_AsesorIA_Unidad4.docx
@@ -4606,7 +4606,7 @@
       <w:r>
         <w:drawing>
           <wp:inline distT="0" distB="0" distL="0" distR="0">
-            <wp:extent cx="4953000" cy="1543050"/>
+            <wp:extent cx="4191000" cy="3057525"/>
             <wp:effectExtent t="0" r="0" b="0" l="0"/>
             <wp:docPr id="1" name="" descr="" title=""/>
             <wp:cNvGraphicFramePr>
@@ -4631,7 +4631,7 @@
                   <pic:spPr bwMode="auto">
                     <a:xfrm>
                       <a:off x="0" y="0"/>
-                      <a:ext cx="4953000" cy="1543050"/>
+                      <a:ext cx="4191000" cy="3057525"/>
                     </a:xfrm>
                     <a:prstGeom prst="rect">
                       <a:avLst/>
@@ -4658,7 +4658,7 @@
           <w:sz w:val="14"/>
           <w:szCs w:val="14"/>
         </w:rPr>
-        <w:t xml:space="preserve">Figura 7b. Diagnóstico generado por TestSprite para el fallo (causa raíz propuesta) con las acciones Re-run y Copy Fix Prompt (self-healing asistido por IA).</w:t>
+        <w:t xml:space="preserve">Figura 7b. Test Report de TestSprite: 4 casos de uso, 11 pruebas (9 pasan, 1 falla, 1 bloqueada), resumen generado por IA y «Fix prompt for your coding agent» (self-healing asistido por IA).</w:t>
       </w:r>
     </w:p>
     <w:p>
@@ -8382,7 +8382,7 @@
       <w:r>
         <w:drawing>
           <wp:inline distT="0" distB="0" distL="0" distR="0">
-            <wp:extent cx="4572000" cy="1114425"/>
+            <wp:extent cx="4000500" cy="2505075"/>
             <wp:effectExtent t="0" r="0" b="0" l="0"/>
             <wp:docPr id="1" name="" descr="" title=""/>
             <wp:cNvGraphicFramePr>
@@ -8407,7 +8407,7 @@
                   <pic:spPr bwMode="auto">
                     <a:xfrm>
                       <a:off x="0" y="0"/>
-                      <a:ext cx="4572000" cy="1114425"/>
+                      <a:ext cx="4000500" cy="2505075"/>
                     </a:xfrm>
                     <a:prstGeom prst="rect">
                       <a:avLst/>
@@ -8434,7 +8434,7 @@
           <w:sz w:val="14"/>
           <w:szCs w:val="14"/>
         </w:rPr>
-        <w:t xml:space="preserve">Figura 12. Stripe Checkout en modo test sobre el despliegue (captura pendiente; ver Anexo).</w:t>
+        <w:t xml:space="preserve">Figura 12. Pasarela de pago sobre el despliegue: página simulada equivalente a Stripe Checkout (tarjeta de prueba 4242…, pagar o cancelar). La integración real con Stripe (Checkout en modo suscripción, success/cancel URL y webhook firmado) está implementada en lib/payments.ts (Figura 3) y se activa con PAYMENTS_PROVIDER=stripe.</w:t>
       </w:r>
     </w:p>
     <w:p>
@@ -8562,7 +8562,7 @@
           <w:sz w:val="22"/>
           <w:szCs w:val="22"/>
         </w:rPr>
-        <w:t xml:space="preserve">Anexo. Pasos pendientes con cuentas propias</w:t>
+        <w:t xml:space="preserve">Anexo A. Trazabilidad de la ejecución con cuentas propias</w:t>
       </w:r>
     </w:p>
     <w:p>
@@ -8600,7 +8600,7 @@
           <w:sz w:val="20"/>
           <w:szCs w:val="20"/>
         </w:rPr>
-        <w:t xml:space="preserve">Stripe: crear claves de prueba y el webhook; configurar STRIPE_SECRET_KEY, STRIPE_WEBHOOK_SECRET y PAYMENTS_PROVIDER=stripe en Vercel y redesplegar (guía §2–3).</w:t>
+        <w:t xml:space="preserve">Stripe en modo test: implementado (StripeProvider) y documentado en la guía §2–3; la validación E2E de este informe se realizó con el proveedor simulado para no depender de credenciales externas.</w:t>
       </w:r>
     </w:p>
     <w:p>
@@ -8643,12 +8643,25 @@
     </w:p>
     <w:p>
       <w:pPr>
-        <w:pStyle w:val="ListParagraph"/>
-        <w:numPr>
-          <w:ilvl w:val="0"/>
-          <w:numId w:val="2"/>
-        </w:numPr>
-        <w:spacing w:after="30" w:line="240"/>
+        <w:pStyle w:val="Heading1"/>
+        <w:keepNext/>
+        <w:spacing w:after="40" w:before="120"/>
+      </w:pPr>
+      <w:r>
+        <w:rPr>
+          <w:rFonts w:ascii="Calibri" w:cs="Calibri" w:eastAsia="Calibri" w:hAnsi="Calibri"/>
+          <w:b/>
+          <w:bCs/>
+          <w:color w:val="0B5CAD"/>
+          <w:sz w:val="22"/>
+          <w:szCs w:val="22"/>
+        </w:rPr>
+        <w:t xml:space="preserve">Anexo B. Galería de evidencia (capturas tomadas durante la ejecución)</w:t>
+      </w:r>
+    </w:p>
+    <w:p>
+      <w:pPr>
+        <w:spacing w:after="40" w:line="236"/>
         <w:jc w:val="both"/>
       </w:pPr>
       <w:r>
@@ -8657,7 +8670,199 @@
           <w:sz w:val="20"/>
           <w:szCs w:val="20"/>
         </w:rPr>
-        <w:t xml:space="preserve">Sustituir la figura 12 por la captura de Stripe Checkout en modo test, y añadir la comparación TestSprite vs. Playwright a la tabla de métricas.</w:t>
+        <w:t xml:space="preserve">Capturas adicionales del proceso, en orden cronológico; complementan las figuras del cuerpo del informe.</w:t>
+      </w:r>
+    </w:p>
+    <w:p>
+      <w:pPr>
+        <w:keepNext/>
+        <w:spacing w:after="20" w:before="60"/>
+        <w:jc w:val="center"/>
+      </w:pPr>
+      <w:r>
+        <w:drawing>
+          <wp:inline distT="0" distB="0" distL="0" distR="0">
+            <wp:extent cx="5905500" cy="3286125"/>
+            <wp:effectExtent t="0" r="0" b="0" l="0"/>
+            <wp:docPr id="1" name="" descr="" title=""/>
+            <wp:cNvGraphicFramePr>
+              <a:graphicFrameLocks xmlns:a="http://schemas.openxmlformats.org/drawingml/2006/main" noChangeAspect="1"/>
+            </wp:cNvGraphicFramePr>
+            <a:graphic xmlns:a="http://schemas.openxmlformats.org/drawingml/2006/main">
+              <a:graphicData uri="http://schemas.openxmlformats.org/drawingml/2006/picture">
+                <pic:pic xmlns:pic="http://schemas.openxmlformats.org/drawingml/2006/picture">
+                  <pic:nvPicPr>
+                    <pic:cNvPr id="0" name="" descr=""/>
+                    <pic:cNvPicPr>
+                      <a:picLocks noChangeAspect="1" noChangeArrowheads="1"/>
+                    </pic:cNvPicPr>
+                  </pic:nvPicPr>
+                  <pic:blipFill>
+                    <a:blip r:embed="rId23" cstate="none"/>
+                    <a:srcRect/>
+                    <a:stretch>
+                      <a:fillRect/>
+                    </a:stretch>
+                  </pic:blipFill>
+                  <pic:spPr bwMode="auto">
+                    <a:xfrm>
+                      <a:off x="0" y="0"/>
+                      <a:ext cx="5905500" cy="3286125"/>
+                    </a:xfrm>
+                    <a:prstGeom prst="rect">
+                      <a:avLst/>
+                    </a:prstGeom>
+                  </pic:spPr>
+                </pic:pic>
+              </a:graphicData>
+            </a:graphic>
+          </wp:inline>
+        </w:drawing>
+      </w:r>
+    </w:p>
+    <w:p>
+      <w:pPr>
+        <w:spacing w:after="100"/>
+        <w:jc w:val="center"/>
+      </w:pPr>
+      <w:r>
+        <w:rPr>
+          <w:rFonts w:ascii="Calibri" w:cs="Calibri" w:eastAsia="Calibri" w:hAnsi="Calibri"/>
+          <w:i/>
+          <w:iCs/>
+          <w:color w:val="5B6675"/>
+          <w:sz w:val="14"/>
+          <w:szCs w:val="14"/>
+        </w:rPr>
+        <w:t xml:space="preserve">Figura B1. Vercel: proyecto recién desplegado, Production Deployment en estado Ready, checklist y observabilidad, /api/health en producción, URL del despliegue generado por el workflow; agente de Cursor clonando el repositorio y haciendo push.</w:t>
+      </w:r>
+    </w:p>
+    <w:p>
+      <w:pPr>
+        <w:keepNext/>
+        <w:spacing w:after="20" w:before="60"/>
+        <w:jc w:val="center"/>
+      </w:pPr>
+      <w:r>
+        <w:drawing>
+          <wp:inline distT="0" distB="0" distL="0" distR="0">
+            <wp:extent cx="5905500" cy="5124450"/>
+            <wp:effectExtent t="0" r="0" b="0" l="0"/>
+            <wp:docPr id="1" name="" descr="" title=""/>
+            <wp:cNvGraphicFramePr>
+              <a:graphicFrameLocks xmlns:a="http://schemas.openxmlformats.org/drawingml/2006/main" noChangeAspect="1"/>
+            </wp:cNvGraphicFramePr>
+            <a:graphic xmlns:a="http://schemas.openxmlformats.org/drawingml/2006/main">
+              <a:graphicData uri="http://schemas.openxmlformats.org/drawingml/2006/picture">
+                <pic:pic xmlns:pic="http://schemas.openxmlformats.org/drawingml/2006/picture">
+                  <pic:nvPicPr>
+                    <pic:cNvPr id="0" name="" descr=""/>
+                    <pic:cNvPicPr>
+                      <a:picLocks noChangeAspect="1" noChangeArrowheads="1"/>
+                    </pic:cNvPicPr>
+                  </pic:nvPicPr>
+                  <pic:blipFill>
+                    <a:blip r:embed="rId24" cstate="none"/>
+                    <a:srcRect/>
+                    <a:stretch>
+                      <a:fillRect/>
+                    </a:stretch>
+                  </pic:blipFill>
+                  <pic:spPr bwMode="auto">
+                    <a:xfrm>
+                      <a:off x="0" y="0"/>
+                      <a:ext cx="5905500" cy="5124450"/>
+                    </a:xfrm>
+                    <a:prstGeom prst="rect">
+                      <a:avLst/>
+                    </a:prstGeom>
+                  </pic:spPr>
+                </pic:pic>
+              </a:graphicData>
+            </a:graphic>
+          </wp:inline>
+        </w:drawing>
+      </w:r>
+    </w:p>
+    <w:p>
+      <w:pPr>
+        <w:spacing w:after="100"/>
+        <w:jc w:val="center"/>
+      </w:pPr>
+      <w:r>
+        <w:rPr>
+          <w:rFonts w:ascii="Calibri" w:cs="Calibri" w:eastAsia="Calibri" w:hAnsi="Calibri"/>
+          <w:i/>
+          <w:iCs/>
+          <w:color w:val="5B6675"/>
+          <w:sz w:val="14"/>
+          <w:szCs w:val="14"/>
+        </w:rPr>
+        <w:t xml:space="preserve">Figura B2. TestSprite: inicio y transcurso de la exploración autónoma, exploración finalizada (3 páginas), ejecución en vivo de las 11 pruebas, resumen con diagnóstico del fallo, lista de resultados, re-run de las 2 pruebas y resultado del re-run (Cancelar y reintentar pasa tras el fix).</w:t>
+      </w:r>
+    </w:p>
+    <w:p>
+      <w:pPr>
+        <w:keepNext/>
+        <w:spacing w:after="20" w:before="60"/>
+        <w:jc w:val="center"/>
+      </w:pPr>
+      <w:r>
+        <w:drawing>
+          <wp:inline distT="0" distB="0" distL="0" distR="0">
+            <wp:extent cx="5905500" cy="3009900"/>
+            <wp:effectExtent t="0" r="0" b="0" l="0"/>
+            <wp:docPr id="1" name="" descr="" title=""/>
+            <wp:cNvGraphicFramePr>
+              <a:graphicFrameLocks xmlns:a="http://schemas.openxmlformats.org/drawingml/2006/main" noChangeAspect="1"/>
+            </wp:cNvGraphicFramePr>
+            <a:graphic xmlns:a="http://schemas.openxmlformats.org/drawingml/2006/main">
+              <a:graphicData uri="http://schemas.openxmlformats.org/drawingml/2006/picture">
+                <pic:pic xmlns:pic="http://schemas.openxmlformats.org/drawingml/2006/picture">
+                  <pic:nvPicPr>
+                    <pic:cNvPr id="0" name="" descr=""/>
+                    <pic:cNvPicPr>
+                      <a:picLocks noChangeAspect="1" noChangeArrowheads="1"/>
+                    </pic:cNvPicPr>
+                  </pic:nvPicPr>
+                  <pic:blipFill>
+                    <a:blip r:embed="rId25" cstate="none"/>
+                    <a:srcRect/>
+                    <a:stretch>
+                      <a:fillRect/>
+                    </a:stretch>
+                  </pic:blipFill>
+                  <pic:spPr bwMode="auto">
+                    <a:xfrm>
+                      <a:off x="0" y="0"/>
+                      <a:ext cx="5905500" cy="3009900"/>
+                    </a:xfrm>
+                    <a:prstGeom prst="rect">
+                      <a:avLst/>
+                    </a:prstGeom>
+                  </pic:spPr>
+                </pic:pic>
+              </a:graphicData>
+            </a:graphic>
+          </wp:inline>
+        </w:drawing>
+      </w:r>
+    </w:p>
+    <w:p>
+      <w:pPr>
+        <w:spacing w:after="100"/>
+        <w:jc w:val="center"/>
+      </w:pPr>
+      <w:r>
+        <w:rPr>
+          <w:rFonts w:ascii="Calibri" w:cs="Calibri" w:eastAsia="Calibri" w:hAnsi="Calibri"/>
+          <w:i/>
+          <w:iCs/>
+          <w:color w:val="5B6675"/>
+          <w:sz w:val="14"/>
+          <w:szCs w:val="14"/>
+        </w:rPr>
+        <w:t xml:space="preserve">Figura B3. GitHub Actions y SonarCloud: historial de deploy-planes, run #3 en curso, run #4 completo, job de smoke en producción, pipeline ci #7 (TDD, Sonar, BDD) y quality gate Passed en SonarCloud (cobertura 96,1 %, 0 issues).</w:t>
       </w:r>
     </w:p>
     <w:sectPr>

</xml_diff>